<commit_message>
AL-202 update ibrahima's AL-16 and AL-142 test cases now that #57 is merged
</commit_message>
<xml_diff>
--- a/docs/sprint-1-submission/ibrahima/AL-142/test-case.docx
+++ b/docs/sprint-1-submission/ibrahima/AL-142/test-case.docx
@@ -233,7 +233,7 @@
               <w:rPr>
                 <w:sz w:val="19"/>
               </w:rPr>
-              <w:t>al-mobile/ (Broker and Home folders) on the stay-signed-in branch, PR #57; not on main yet, repository CS3-Agentic-Lender/agentic-lender</w:t>
+              <w:t>al-mobile/ (Broker and Home folders) on branch main (reached main with PR #57 on 22 Oct), repository CS3-Agentic-Lender/agentic-lender</w:t>
             </w:r>
           </w:p>
         </w:tc>
@@ -339,7 +339,7 @@
         <w:pStyle w:val="ListBullet"/>
       </w:pPr>
       <w:r>
-        <w:t>Unit test results on 22 Oct 2026: 221 tests on the PR #57 branch with main merged in, 0 failures.</w:t>
+        <w:t>Unit test results on 22 Oct 2026: 221 tests on PR #57 just before it merged into main, 0 failures.</w:t>
       </w:r>
     </w:p>
     <w:p>
@@ -527,7 +527,7 @@
               <w:rPr>
                 <w:sz w:val="19"/>
               </w:rPr>
-              <w:t>Automated: BrokerPickerViewModelTests &gt; testListsTheBrokersByNameAndFirm, testContinueNeedsABrokerSelected, testChoosingAfterSignUpSaysContinue; HomeGateViewModelTests &gt; testABorrowerWithoutABrokerMustChooseOneBeforeHome, testChoosingABrokerOpensHome. End to end (15 Oct): the list showed Bob Murphy and Ciara Kelly, and choosing Bob reached home. Pass on the branch.</w:t>
+              <w:t>Automated: BrokerPickerViewModelTests &gt; testListsTheBrokersByNameAndFirm, testContinueNeedsABrokerSelected, testChoosingAfterSignUpSaysContinue; HomeGateViewModelTests &gt; testABorrowerWithoutABrokerMustChooseOneBeforeHome, testChoosingABrokerOpensHome. End to end (15 Oct): the list showed Bob Murphy and Ciara Kelly, and choosing Bob reached home. Pass (on main).</w:t>
             </w:r>
           </w:p>
         </w:tc>
@@ -594,7 +594,7 @@
               <w:rPr>
                 <w:sz w:val="19"/>
               </w:rPr>
-              <w:t>Automated: CoreProfileAPITests &gt; testChooseBrokerPutsTheIDAndReadsBackTheProfile, testProfileReadsTheNameAndBrokerFromCoreMe; HomeViewModelTests &gt; testShowsTheChosenBrokerAndFirm. End to end (15 Oct): PUT /core/me/broker returned 200, the choice came back on the next read, and a uid that isn't a broker was refused with 422. Portal side: checked with Nikoloz in the broker portal, where the chosen broker could see the borrower. Pass on the branch.</w:t>
+              <w:t>Automated: CoreProfileAPITests &gt; testChooseBrokerPutsTheIDAndReadsBackTheProfile, testProfileReadsTheNameAndBrokerFromCoreMe; HomeViewModelTests &gt; testShowsTheChosenBrokerAndFirm. End to end (15 Oct): PUT /core/me/broker returned 200, the choice came back on the next read, and a uid that isn't a broker was refused with 422. Portal side: checked with Nikoloz in the broker portal, where the chosen broker could see the borrower. Pass (on main).</w:t>
             </w:r>
           </w:p>
         </w:tc>
@@ -661,7 +661,7 @@
               <w:rPr>
                 <w:sz w:val="19"/>
               </w:rPr>
-              <w:t>Automated: BrokerPickerViewModelTests &gt; testChangingStartsOnTheCurrentBrokerAndSaysSave, testSaveStaysOffUntilADifferentBrokerIsPicked, testSavingSendsTheChoiceAndReturnsTheUpdatedProfile; HomeViewModelTests &gt; testChangingBrokerUpdatesTheCard. Simulator: home after changing broker. Who can see the application is enforced by al-core's rules (Dumi's broker assignment subtask), not by the app. Pass on the branch.</w:t>
+              <w:t>Automated: BrokerPickerViewModelTests &gt; testChangingStartsOnTheCurrentBrokerAndSaysSave, testSaveStaysOffUntilADifferentBrokerIsPicked, testSavingSendsTheChoiceAndReturnsTheUpdatedProfile; HomeViewModelTests &gt; testChangingBrokerUpdatesTheCard. Simulator: home after changing broker. Who can see the application is enforced by al-core's rules (Dumi's broker assignment subtask), not by the app. Pass (on main).</w:t>
             </w:r>
           </w:p>
         </w:tc>
@@ -728,7 +728,7 @@
               <w:rPr>
                 <w:sz w:val="19"/>
               </w:rPr>
-              <w:t>Automated: BrokerPickerViewModelTests &gt; testAListThatCantLoadSaysWhyAndRetryLoadsAgain, testNoBrokersShowsTheEmptyMessage; CoreProfileAPITests &gt; testNoConnectionWhenListingBrokersIsANetworkError. Pass on the branch.</w:t>
+              <w:t>Automated: BrokerPickerViewModelTests &gt; testAListThatCantLoadSaysWhyAndRetryLoadsAgain, testNoBrokersShowsTheEmptyMessage; CoreProfileAPITests &gt; testNoConnectionWhenListingBrokersIsANetworkError. Pass (on main).</w:t>
             </w:r>
           </w:p>
         </w:tc>
@@ -795,7 +795,7 @@
               <w:rPr>
                 <w:sz w:val="19"/>
               </w:rPr>
-              <w:t>Automated: BrokerPickerViewModelTests &gt; testAFailedSaveKeepsTheChoiceAndShowsAnError, testSavingAgainAfterAFailureClearsTheError. Pass on the branch.</w:t>
+              <w:t>Automated: BrokerPickerViewModelTests &gt; testAFailedSaveKeepsTheChoiceAndShowsAnError, testSavingAgainAfterAFailureClearsTheError. Pass (on main).</w:t>
             </w:r>
           </w:p>
         </w:tc>
@@ -815,7 +815,7 @@
         <w:pStyle w:val="ListBullet"/>
       </w:pPr>
       <w:r>
-        <w:t>Not merged: PR #58 (AL-95) was merged into the stay-signed-in branch instead of main on 21 Oct, so this code reaches main with PR #57 or its own PR, as agreed with Nic in #dev. AL-95 is In Review.</w:t>
+        <w:t>PR #58 (AL-95) was merged into the stay-signed-in branch instead of main on 19 Oct (found on 21 Oct). The code reached main with PR #57 on 22 Oct, and AL-95 is Done.</w:t>
       </w:r>
     </w:p>
     <w:p>

</xml_diff>